<commit_message>
feat: expand compliance dashboard, polish UI, fix tests, add requirements.txt
</commit_message>
<xml_diff>
--- a/Budapest Bootcamp 2026 by Islam Zholochiev.docx
+++ b/Budapest Bootcamp 2026 by Islam Zholochiev.docx
@@ -6,7 +6,7 @@
       <w:pPr>
         <w:pStyle w:val="Heading1"/>
         <w:rPr>
-          <w:lang w:val="ru-RU"/>
+          <w:lang w:val="en-US"/>
         </w:rPr>
       </w:pPr>
       <w:r>
@@ -16,7 +16,7 @@
     <w:p>
       <w:pPr>
         <w:rPr>
-          <w:lang w:val="ru-RU"/>
+          <w:lang w:val="en-US"/>
         </w:rPr>
       </w:pPr>
     </w:p>
@@ -101,7 +101,7 @@
         <w:rPr>
           <w:sz w:val="28"/>
           <w:szCs w:val="28"/>
-          <w:lang w:val="ru-RU"/>
+          <w:lang w:val="en-US"/>
         </w:rPr>
       </w:pPr>
       <w:r>
@@ -126,7 +126,7 @@
           <w:szCs w:val="28"/>
           <w:lang w:val="en-US"/>
         </w:rPr>
-        <w:t>9</w:t>
+        <w:t>10</w:t>
       </w:r>
       <w:r>
         <w:rPr>
@@ -162,7 +162,14 @@
           <w:sz w:val="28"/>
           <w:szCs w:val="28"/>
         </w:rPr>
-        <w:t>This is an educational portfolio project simulating EU AI Act compliance workflows for credit scoring. It is not a certified, legally compliant, or production-deployed system.</w:t>
+        <w:t>This is an educational project simulating EU AI Act compliance workflows for credit scoring. It is not a certified, legally compliant, or production-deployed system</w:t>
+      </w:r>
+      <w:r>
+        <w:rPr>
+          <w:sz w:val="28"/>
+          <w:szCs w:val="28"/>
+        </w:rPr>
+        <w:t>.</w:t>
       </w:r>
     </w:p>
     <w:p>
@@ -205,7 +212,22 @@
         <w:ind w:firstLine="720"/>
       </w:pPr>
       <w:r>
-        <w:t xml:space="preserve">As a Data Science and Economics student, I designed this 9-day solo bootcamp in Budapest to build a </w:t>
+        <w:t xml:space="preserve">As a Data Science and Economics student, I designed this </w:t>
+      </w:r>
+      <w:r>
+        <w:rPr>
+          <w:lang w:val="en-US"/>
+        </w:rPr>
+        <w:t>10</w:t>
+      </w:r>
+      <w:r>
+        <w:t>-day</w:t>
+      </w:r>
+      <w:r>
+        <w:t xml:space="preserve"> </w:t>
+      </w:r>
+      <w:r>
+        <w:t xml:space="preserve">bootcamp in Budapest to build a </w:t>
       </w:r>
       <w:r>
         <w:rPr>
@@ -621,7 +643,7 @@
       <w:pPr>
         <w:pStyle w:val="NormalWeb"/>
         <w:rPr>
-          <w:lang w:val="ru-RU"/>
+          <w:lang w:val="en-US"/>
         </w:rPr>
       </w:pPr>
     </w:p>
@@ -1244,6 +1266,86 @@
       <w:r>
         <w:t xml:space="preserve"> This dataset was chosen for iteration speed and local prototyping during an intensive 9-day sprint. While significantly more realistic than small toy datasets, a production bank system would require an enterprise-grade dataset with multi-year macro-economic cycle coverage.</w:t>
       </w:r>
+    </w:p>
+    <w:p>
+      <w:pPr>
+        <w:pStyle w:val="NormalWeb"/>
+        <w:rPr>
+          <w:lang w:val="ru-RU"/>
+        </w:rPr>
+      </w:pPr>
+    </w:p>
+    <w:p>
+      <w:pPr>
+        <w:pStyle w:val="NormalWeb"/>
+        <w:rPr>
+          <w:lang w:val="ru-RU"/>
+        </w:rPr>
+      </w:pPr>
+    </w:p>
+    <w:p>
+      <w:pPr>
+        <w:pStyle w:val="NormalWeb"/>
+        <w:rPr>
+          <w:lang w:val="ru-RU"/>
+        </w:rPr>
+      </w:pPr>
+    </w:p>
+    <w:p>
+      <w:pPr>
+        <w:pStyle w:val="NormalWeb"/>
+        <w:rPr>
+          <w:lang w:val="ru-RU"/>
+        </w:rPr>
+      </w:pPr>
+    </w:p>
+    <w:p>
+      <w:pPr>
+        <w:pStyle w:val="NormalWeb"/>
+        <w:rPr>
+          <w:lang w:val="ru-RU"/>
+        </w:rPr>
+      </w:pPr>
+    </w:p>
+    <w:p>
+      <w:pPr>
+        <w:pStyle w:val="NormalWeb"/>
+        <w:rPr>
+          <w:lang w:val="ru-RU"/>
+        </w:rPr>
+      </w:pPr>
+    </w:p>
+    <w:p>
+      <w:pPr>
+        <w:pStyle w:val="NormalWeb"/>
+        <w:rPr>
+          <w:lang w:val="ru-RU"/>
+        </w:rPr>
+      </w:pPr>
+    </w:p>
+    <w:p>
+      <w:pPr>
+        <w:pStyle w:val="NormalWeb"/>
+        <w:rPr>
+          <w:lang w:val="ru-RU"/>
+        </w:rPr>
+      </w:pPr>
+    </w:p>
+    <w:p>
+      <w:pPr>
+        <w:pStyle w:val="NormalWeb"/>
+        <w:rPr>
+          <w:lang w:val="ru-RU"/>
+        </w:rPr>
+      </w:pPr>
+    </w:p>
+    <w:p>
+      <w:pPr>
+        <w:pStyle w:val="NormalWeb"/>
+        <w:rPr>
+          <w:lang w:val="ru-RU"/>
+        </w:rPr>
+      </w:pPr>
     </w:p>
     <w:p>
       <w:pPr>

</xml_diff>